<commit_message>
Rewrite the resume around coursework areas instead of SQL syntax.
Drop the competency paragraph and function-level bullets, and keep Yingxi focused on the decision the dashboard supports.

Co-authored-by: entice0328 <entice0328@gmail.com>
</commit_message>
<xml_diff>
--- a/Zhang_Liyuan_Data_Analyst_Resume.docx
+++ b/Zhang_Liyuan_Data_Analyst_Resume.docx
@@ -4,15 +4,28 @@
   <w:body>
     <w:p>
       <w:pPr>
-        <w:spacing w:after="20" w:before="0" w:line="259" w:lineRule="auto"/>
+        <w:spacing w:after="40" w:before="0" w:line="259" w:lineRule="auto"/>
       </w:pPr>
       <w:r>
         <w:rPr>
-          <w:rFonts w:ascii="Calibri" w:hAnsi="Calibri" w:eastAsia="微软雅黑" w:cs="Calibri"/>
           <w:b/>
           <w:sz w:val="44"/>
+          <w:rFonts w:ascii="Calibri" w:hAnsi="Calibri" w:eastAsia="微软雅黑"/>
         </w:rPr>
         <w:t>张力元</w:t>
+      </w:r>
+    </w:p>
+    <w:p>
+      <w:pPr>
+        <w:spacing w:after="0" w:before="0" w:line="259" w:lineRule="auto"/>
+      </w:pPr>
+      <w:r>
+        <w:rPr>
+          <w:b w:val="0"/>
+          <w:sz w:val="22"/>
+          <w:rFonts w:ascii="Calibri" w:hAnsi="Calibri" w:eastAsia="微软雅黑"/>
+        </w:rPr>
+        <w:t>15752886130    entice0328@gmail.com</w:t>
       </w:r>
     </w:p>
     <w:p>
@@ -21,436 +34,280 @@
       </w:pPr>
       <w:r>
         <w:rPr>
-          <w:rFonts w:ascii="Calibri" w:hAnsi="Calibri" w:eastAsia="微软雅黑" w:cs="Calibri"/>
           <w:b w:val="0"/>
-          <w:color w:val="464646"/>
           <w:sz w:val="22"/>
-        </w:rPr>
-        <w:t>数据分析实习生  |  数据运营 / 商业分析 / BI  |  求职城市：武汉</w:t>
-      </w:r>
-    </w:p>
-    <w:p>
-      <w:pPr>
-        <w:spacing w:after="0" w:before="0" w:line="259" w:lineRule="auto"/>
-      </w:pPr>
-      <w:r>
-        <w:rPr>
-          <w:rFonts w:ascii="Calibri" w:hAnsi="Calibri" w:eastAsia="微软雅黑" w:cs="Calibri"/>
-          <w:b w:val="0"/>
-          <w:sz w:val="21"/>
-        </w:rPr>
-        <w:t>15752886130    entice0328@gmail.com</w:t>
-      </w:r>
-    </w:p>
-    <w:p>
-      <w:pPr>
-        <w:spacing w:after="0" w:before="0" w:line="259" w:lineRule="auto"/>
-      </w:pPr>
-      <w:r>
-        <w:rPr>
-          <w:rFonts w:ascii="Calibri" w:hAnsi="Calibri" w:eastAsia="微软雅黑" w:cs="Calibri"/>
-          <w:b w:val="0"/>
-          <w:sz w:val="21"/>
-        </w:rPr>
-        <w:t>演示    https://yingxi-analytics.vercel.app</w:t>
-      </w:r>
-    </w:p>
-    <w:p>
-      <w:pPr>
-        <w:spacing w:after="40" w:before="0" w:line="259" w:lineRule="auto"/>
-      </w:pPr>
-      <w:r>
-        <w:rPr>
-          <w:rFonts w:ascii="Calibri" w:hAnsi="Calibri" w:eastAsia="微软雅黑" w:cs="Calibri"/>
-          <w:b w:val="0"/>
-          <w:sz w:val="21"/>
+          <w:rFonts w:ascii="Calibri" w:hAnsi="Calibri" w:eastAsia="微软雅黑"/>
         </w:rPr>
         <w:t>代码    https://github.com/entice0328-cloud/yingxi-analytics</w:t>
       </w:r>
     </w:p>
     <w:p>
       <w:pPr>
-        <w:spacing w:after="60" w:before="160" w:line="259" w:lineRule="auto"/>
+        <w:spacing w:after="80" w:before="200" w:line="259" w:lineRule="auto"/>
         <w:pBdr>
           <w:bottom w:val="single" w:sz="8" w:space="1" w:color="1F6F6A"/>
         </w:pBdr>
       </w:pPr>
       <w:r>
         <w:rPr>
-          <w:rFonts w:ascii="Calibri" w:hAnsi="Calibri" w:eastAsia="微软雅黑" w:cs="Calibri"/>
           <w:b/>
           <w:color w:val="1F6F6A"/>
-          <w:sz w:val="24"/>
+          <w:sz w:val="26"/>
+          <w:rFonts w:ascii="Calibri" w:hAnsi="Calibri" w:eastAsia="微软雅黑"/>
         </w:rPr>
         <w:t>求职意向</w:t>
       </w:r>
     </w:p>
     <w:p>
       <w:pPr>
-        <w:spacing w:after="40" w:before="0" w:line="259" w:lineRule="auto"/>
+        <w:spacing w:after="60" w:before="0" w:line="259" w:lineRule="auto"/>
       </w:pPr>
       <w:r>
         <w:rPr>
-          <w:rFonts w:ascii="Calibri" w:hAnsi="Calibri" w:eastAsia="微软雅黑" w:cs="Calibri"/>
           <w:b w:val="0"/>
-          <w:sz w:val="21"/>
+          <w:sz w:val="22"/>
+          <w:rFonts w:ascii="Calibri" w:hAnsi="Calibri" w:eastAsia="微软雅黑"/>
         </w:rPr>
-        <w:t>数据分析实习生、数据运营、商业分析、BI。计划 2026 年 1 月到武汉实习，10 月起可沟通，12 月可面试。到岗后可以做：按口径写 SQL、对看板数字、整理周报里的结论和建议。</w:t>
+        <w:t>武汉 · 数据分析 / 数据运营 / 商业分析 / BI 实习。计划 2026 年 1 月到岗，10 月起可沟通，12 月可面试。</w:t>
       </w:r>
     </w:p>
     <w:p>
       <w:pPr>
-        <w:spacing w:after="60" w:before="160" w:line="259" w:lineRule="auto"/>
+        <w:spacing w:after="80" w:before="200" w:line="259" w:lineRule="auto"/>
         <w:pBdr>
           <w:bottom w:val="single" w:sz="8" w:space="1" w:color="1F6F6A"/>
         </w:pBdr>
       </w:pPr>
       <w:r>
         <w:rPr>
-          <w:rFonts w:ascii="Calibri" w:hAnsi="Calibri" w:eastAsia="微软雅黑" w:cs="Calibri"/>
           <w:b/>
           <w:color w:val="1F6F6A"/>
-          <w:sz w:val="24"/>
+          <w:sz w:val="26"/>
+          <w:rFonts w:ascii="Calibri" w:hAnsi="Calibri" w:eastAsia="微软雅黑"/>
         </w:rPr>
         <w:t>教育背景</w:t>
       </w:r>
     </w:p>
     <w:p>
       <w:pPr>
-        <w:spacing w:after="0" w:before="0" w:line="259" w:lineRule="auto"/>
+        <w:spacing w:after="20" w:before="0" w:line="259" w:lineRule="auto"/>
       </w:pPr>
       <w:r>
         <w:rPr>
-          <w:rFonts w:ascii="Calibri" w:hAnsi="Calibri" w:eastAsia="微软雅黑" w:cs="Calibri"/>
           <w:b/>
-          <w:sz w:val="21"/>
+          <w:sz w:val="22"/>
+          <w:rFonts w:ascii="Calibri" w:hAnsi="Calibri" w:eastAsia="微软雅黑"/>
         </w:rPr>
         <w:t>Asia Pacific University of Technology &amp; Innovation（APU）</w:t>
       </w:r>
     </w:p>
     <w:p>
       <w:pPr>
-        <w:spacing w:after="40" w:before="0" w:line="259" w:lineRule="auto"/>
+        <w:spacing w:after="20" w:before="0" w:line="259" w:lineRule="auto"/>
       </w:pPr>
       <w:r>
         <w:rPr>
-          <w:rFonts w:ascii="Calibri" w:hAnsi="Calibri" w:eastAsia="微软雅黑" w:cs="Calibri"/>
           <w:b w:val="0"/>
-          <w:sz w:val="21"/>
+          <w:sz w:val="22"/>
+          <w:rFonts w:ascii="Calibri" w:hAnsi="Calibri" w:eastAsia="微软雅黑"/>
         </w:rPr>
-        <w:t>Bachelor of Computer Science (Data Analytics)    2025 – 至今    本科二年级</w:t>
+        <w:t>Bachelor of Science (Honours) in Computer Science with a specialism in Data Analytics</w:t>
       </w:r>
     </w:p>
     <w:p>
       <w:pPr>
-        <w:spacing w:after="40" w:before="80" w:line="259" w:lineRule="auto"/>
+        <w:spacing w:after="60" w:before="0" w:line="259" w:lineRule="auto"/>
       </w:pPr>
       <w:r>
         <w:rPr>
-          <w:rFonts w:ascii="Calibri" w:hAnsi="Calibri" w:eastAsia="微软雅黑" w:cs="Calibri"/>
+          <w:b w:val="0"/>
+          <w:sz w:val="22"/>
+          <w:rFonts w:ascii="Calibri" w:hAnsi="Calibri" w:eastAsia="微软雅黑"/>
+        </w:rPr>
+        <w:t>2025 – 至今    本科二年级</w:t>
+      </w:r>
+    </w:p>
+    <w:p>
+      <w:pPr>
+        <w:spacing w:after="40" w:before="120" w:line="259" w:lineRule="auto"/>
+      </w:pPr>
+      <w:r>
+        <w:rPr>
           <w:b/>
-          <w:sz w:val="21"/>
+          <w:sz w:val="22"/>
+          <w:rFonts w:ascii="Calibri" w:hAnsi="Calibri" w:eastAsia="微软雅黑"/>
         </w:rPr>
-        <w:t>大一已修</w:t>
+        <w:t>课程</w:t>
       </w:r>
     </w:p>
     <w:p>
       <w:pPr>
         <w:pStyle w:val="ListBullet"/>
-        <w:spacing w:after="20" w:before="0" w:line="259" w:lineRule="auto"/>
+        <w:spacing w:after="40" w:line="259" w:lineRule="auto"/>
       </w:pPr>
       <w:r>
         <w:rPr>
-          <w:rFonts w:ascii="Calibri" w:hAnsi="Calibri" w:eastAsia="微软雅黑" w:cs="Calibri"/>
           <w:b w:val="0"/>
-          <w:sz w:val="21"/>
+          <w:sz w:val="22"/>
+          <w:rFonts w:ascii="Calibri" w:hAnsi="Calibri" w:eastAsia="微软雅黑"/>
         </w:rPr>
-        <w:t>Python Programming：变量、函数、条件、循环；list 与 dict；用字典按类别计数；读写简单文本。能独立完成课程规模的小程序。</w:t>
+        <w:t>大一：Python Programming，Introduction to C Programming，Introduction to Databases，Systems Analysis and Design，Introduction to Networking，Systems Software and Computing Concepts，Integrated Computer Systems，Mathematical Concepts for Computing，Introduction to Artificial Intelligence</w:t>
       </w:r>
     </w:p>
     <w:p>
       <w:pPr>
         <w:pStyle w:val="ListBullet"/>
-        <w:spacing w:after="20" w:before="0" w:line="259" w:lineRule="auto"/>
+        <w:spacing w:after="40" w:line="259" w:lineRule="auto"/>
       </w:pPr>
       <w:r>
         <w:rPr>
-          <w:rFonts w:ascii="Calibri" w:hAnsi="Calibri" w:eastAsia="微软雅黑" w:cs="Calibri"/>
           <w:b w:val="0"/>
-          <w:sz w:val="21"/>
+          <w:sz w:val="22"/>
+          <w:rFonts w:ascii="Calibri" w:hAnsi="Calibri" w:eastAsia="微软雅黑"/>
         </w:rPr>
-        <w:t>Introduction to C Programming：变量、分支、循环、函数。</w:t>
+        <w:t>大二在修（没上过的删掉）：Object Oriented Development with Java，Probability and Statistical Modelling，Data Structures，Data Management，Data Mining and Predictive Modelling</w:t>
+      </w:r>
+    </w:p>
+    <w:p>
+      <w:pPr>
+        <w:spacing w:after="40" w:before="120" w:line="259" w:lineRule="auto"/>
+      </w:pPr>
+      <w:r>
+        <w:rPr>
+          <w:b/>
+          <w:sz w:val="22"/>
+          <w:rFonts w:ascii="Calibri" w:hAnsi="Calibri" w:eastAsia="微软雅黑"/>
+        </w:rPr>
+        <w:t>专业知识</w:t>
       </w:r>
     </w:p>
     <w:p>
       <w:pPr>
         <w:pStyle w:val="ListBullet"/>
-        <w:spacing w:after="20" w:before="0" w:line="259" w:lineRule="auto"/>
+        <w:spacing w:after="40" w:line="259" w:lineRule="auto"/>
       </w:pPr>
       <w:r>
         <w:rPr>
-          <w:rFonts w:ascii="Calibri" w:hAnsi="Calibri" w:eastAsia="微软雅黑" w:cs="Calibri"/>
           <w:b w:val="0"/>
-          <w:sz w:val="21"/>
+          <w:sz w:val="22"/>
+          <w:rFonts w:ascii="Calibri" w:hAnsi="Calibri" w:eastAsia="微软雅黑"/>
         </w:rPr>
-        <w:t>Introduction to Databases：表、主键、表与表的关系；SQL 的 WHERE、AND/OR、ORDER BY、COUNT、SUM。</w:t>
+        <w:t>理论：计算相关数学，概率与统计，数据结构与算法基础</w:t>
       </w:r>
     </w:p>
     <w:p>
       <w:pPr>
         <w:pStyle w:val="ListBullet"/>
-        <w:spacing w:after="20" w:before="0" w:line="259" w:lineRule="auto"/>
+        <w:spacing w:after="40" w:line="259" w:lineRule="auto"/>
       </w:pPr>
       <w:r>
         <w:rPr>
-          <w:rFonts w:ascii="Calibri" w:hAnsi="Calibri" w:eastAsia="微软雅黑" w:cs="Calibri"/>
           <w:b w:val="0"/>
-          <w:sz w:val="21"/>
+          <w:sz w:val="22"/>
+          <w:rFonts w:ascii="Calibri" w:hAnsi="Calibri" w:eastAsia="微软雅黑"/>
         </w:rPr>
-        <w:t>Systems Analysis and Design：先画业务流程，再定实体和字段，最后写成能查询的表。</w:t>
+        <w:t>系统：计算机组成与操作系统入门，计算机网络，集成计算机系统</w:t>
       </w:r>
     </w:p>
     <w:p>
       <w:pPr>
         <w:pStyle w:val="ListBullet"/>
-        <w:spacing w:after="20" w:before="0" w:line="259" w:lineRule="auto"/>
+        <w:spacing w:after="40" w:line="259" w:lineRule="auto"/>
       </w:pPr>
       <w:r>
         <w:rPr>
-          <w:rFonts w:ascii="Calibri" w:hAnsi="Calibri" w:eastAsia="微软雅黑" w:cs="Calibri"/>
           <w:b w:val="0"/>
-          <w:sz w:val="21"/>
+          <w:sz w:val="22"/>
+          <w:rFonts w:ascii="Calibri" w:hAnsi="Calibri" w:eastAsia="微软雅黑"/>
         </w:rPr>
-        <w:t>计算机基础：Introduction to Networking、Systems Software and Computing Concepts、Integrated Computer Systems、Mathematical Concepts for Computing、Introduction to Artificial Intelligence。内容包括网络连接、操作系统与计算机组成入门、计算所用数学、人工智能的基本概念。</w:t>
-      </w:r>
-    </w:p>
-    <w:p>
-      <w:pPr>
-        <w:spacing w:after="40" w:before="80" w:line="259" w:lineRule="auto"/>
-      </w:pPr>
-      <w:r>
-        <w:rPr>
-          <w:rFonts w:ascii="Calibri" w:hAnsi="Calibri" w:eastAsia="微软雅黑" w:cs="Calibri"/>
-          <w:b/>
-          <w:sz w:val="21"/>
-        </w:rPr>
-        <w:t>大二在修（没上过的整行删掉）</w:t>
+        <w:t>软件工程：系统分析与设计，从业务需求拆到功能和数据，面向对象设计</w:t>
       </w:r>
     </w:p>
     <w:p>
       <w:pPr>
         <w:pStyle w:val="ListBullet"/>
-        <w:spacing w:after="20" w:before="0" w:line="259" w:lineRule="auto"/>
+        <w:spacing w:after="40" w:line="259" w:lineRule="auto"/>
       </w:pPr>
       <w:r>
         <w:rPr>
-          <w:rFonts w:ascii="Calibri" w:hAnsi="Calibri" w:eastAsia="微软雅黑" w:cs="Calibri"/>
           <w:b w:val="0"/>
-          <w:sz w:val="21"/>
+          <w:sz w:val="22"/>
+          <w:rFonts w:ascii="Calibri" w:hAnsi="Calibri" w:eastAsia="微软雅黑"/>
         </w:rPr>
-        <w:t>Object Oriented Development with Java：类、对象、方法；把一个小系统拆成客户、任务、记录几块。</w:t>
+        <w:t>数据科学：数据库设计与查询，数据管理，数据挖掘入门</w:t>
       </w:r>
     </w:p>
     <w:p>
       <w:pPr>
         <w:pStyle w:val="ListBullet"/>
-        <w:spacing w:after="20" w:before="0" w:line="259" w:lineRule="auto"/>
+        <w:spacing w:after="40" w:line="259" w:lineRule="auto"/>
       </w:pPr>
       <w:r>
         <w:rPr>
-          <w:rFonts w:ascii="Calibri" w:hAnsi="Calibri" w:eastAsia="微软雅黑" w:cs="Calibri"/>
           <w:b w:val="0"/>
-          <w:sz w:val="21"/>
+          <w:sz w:val="22"/>
+          <w:rFonts w:ascii="Calibri" w:hAnsi="Calibri" w:eastAsia="微软雅黑"/>
         </w:rPr>
-        <w:t>Probability and Statistical Modelling：均值、占比、相关、一元回归。课堂用 R 做过描述统计。</w:t>
+        <w:t>人工智能：人工智能的基本概念和简单应用</w:t>
       </w:r>
     </w:p>
     <w:p>
       <w:pPr>
         <w:pStyle w:val="ListBullet"/>
-        <w:spacing w:after="20" w:before="0" w:line="259" w:lineRule="auto"/>
+        <w:spacing w:after="40" w:line="259" w:lineRule="auto"/>
       </w:pPr>
       <w:r>
         <w:rPr>
-          <w:rFonts w:ascii="Calibri" w:hAnsi="Calibri" w:eastAsia="微软雅黑" w:cs="Calibri"/>
           <w:b w:val="0"/>
-          <w:sz w:val="21"/>
+          <w:sz w:val="22"/>
+          <w:rFonts w:ascii="Calibri" w:hAnsi="Calibri" w:eastAsia="微软雅黑"/>
         </w:rPr>
-        <w:t>Data Structures：数组、链表这一级的基本结构，知道查找和遍历在做什么。</w:t>
+        <w:t>编程与工具：Python，C，Java，R，Power BI</w:t>
       </w:r>
     </w:p>
     <w:p>
       <w:pPr>
-        <w:pStyle w:val="ListBullet"/>
-        <w:spacing w:after="20" w:before="0" w:line="259" w:lineRule="auto"/>
-      </w:pPr>
-      <w:r>
-        <w:rPr>
-          <w:rFonts w:ascii="Calibri" w:hAnsi="Calibri" w:eastAsia="微软雅黑" w:cs="Calibri"/>
-          <w:b w:val="0"/>
-          <w:sz w:val="21"/>
-        </w:rPr>
-        <w:t>Data Management：在数据库导论之后，继续做数据整理和多条件查询。</w:t>
-      </w:r>
-    </w:p>
-    <w:p>
-      <w:pPr>
-        <w:pStyle w:val="ListBullet"/>
-        <w:spacing w:after="20" w:before="0" w:line="259" w:lineRule="auto"/>
-      </w:pPr>
-      <w:r>
-        <w:rPr>
-          <w:rFonts w:ascii="Calibri" w:hAnsi="Calibri" w:eastAsia="微软雅黑" w:cs="Calibri"/>
-          <w:b w:val="0"/>
-          <w:sz w:val="21"/>
-        </w:rPr>
-        <w:t>Data Mining and Predictive Modelling：知道分类、聚类、预测模型这些词指什么。模型没做成能上线的系统，简历里不写成会部署模型。</w:t>
-      </w:r>
-    </w:p>
-    <w:p>
-      <w:pPr>
-        <w:spacing w:after="60" w:before="160" w:line="259" w:lineRule="auto"/>
+        <w:spacing w:after="80" w:before="200" w:line="259" w:lineRule="auto"/>
         <w:pBdr>
           <w:bottom w:val="single" w:sz="8" w:space="1" w:color="1F6F6A"/>
         </w:pBdr>
       </w:pPr>
       <w:r>
         <w:rPr>
-          <w:rFonts w:ascii="Calibri" w:hAnsi="Calibri" w:eastAsia="微软雅黑" w:cs="Calibri"/>
           <w:b/>
           <w:color w:val="1F6F6A"/>
-          <w:sz w:val="24"/>
+          <w:sz w:val="26"/>
+          <w:rFonts w:ascii="Calibri" w:hAnsi="Calibri" w:eastAsia="微软雅黑"/>
         </w:rPr>
         <w:t>工作坊</w:t>
       </w:r>
     </w:p>
     <w:p>
       <w:pPr>
-        <w:pStyle w:val="ListBullet"/>
-        <w:spacing w:after="20" w:before="0" w:line="259" w:lineRule="auto"/>
+        <w:spacing w:after="60" w:before="0" w:line="259" w:lineRule="auto"/>
       </w:pPr>
       <w:r>
         <w:rPr>
-          <w:rFonts w:ascii="Calibri" w:hAnsi="Calibri" w:eastAsia="微软雅黑" w:cs="Calibri"/>
           <w:b w:val="0"/>
-          <w:sz w:val="21"/>
+          <w:sz w:val="22"/>
+          <w:rFonts w:ascii="Calibri" w:hAnsi="Calibri" w:eastAsia="微软雅黑"/>
         </w:rPr>
-        <w:t>2026 年 8 月 18 日参加 APAC 的 Introduction to Power BI Workshop，拿到参与证书。内容是把表导入 Power BI、做基础图表。这是社团工作坊的参与证明，不是微软 Power BI（PL-300）认证。面试时这样说即可。</w:t>
+        <w:t>2026 年 8 月 18 日参加 APAC 的 Introduction to Power BI Workshop，获参与证书。内容是把数据导入 Power BI 并做基础图表。</w:t>
       </w:r>
     </w:p>
     <w:p>
       <w:pPr>
-        <w:spacing w:after="60" w:before="160" w:line="259" w:lineRule="auto"/>
+        <w:spacing w:after="80" w:before="200" w:line="259" w:lineRule="auto"/>
         <w:pBdr>
           <w:bottom w:val="single" w:sz="8" w:space="1" w:color="1F6F6A"/>
         </w:pBdr>
       </w:pPr>
       <w:r>
         <w:rPr>
-          <w:rFonts w:ascii="Calibri" w:hAnsi="Calibri" w:eastAsia="微软雅黑" w:cs="Calibri"/>
           <w:b/>
           <w:color w:val="1F6F6A"/>
-          <w:sz w:val="24"/>
-        </w:rPr>
-        <w:t>取数时会写的 SQL</w:t>
-      </w:r>
-    </w:p>
-    <w:p>
-      <w:pPr>
-        <w:spacing w:after="40" w:before="0" w:line="259" w:lineRule="auto"/>
-      </w:pPr>
-      <w:r>
-        <w:rPr>
-          <w:rFonts w:ascii="Calibri" w:hAnsi="Calibri" w:eastAsia="微软雅黑" w:cs="Calibri"/>
-          <w:b w:val="0"/>
-          <w:sz w:val="21"/>
-        </w:rPr>
-        <w:t>这些句子对应营析「方法」页里的查询，面试可以打开页面照着讲，也可以在纸上重写。</w:t>
-      </w:r>
-    </w:p>
-    <w:p>
-      <w:pPr>
-        <w:pStyle w:val="ListBullet"/>
-        <w:spacing w:after="20" w:before="0" w:line="259" w:lineRule="auto"/>
-      </w:pPr>
-      <w:r>
-        <w:rPr>
-          <w:rFonts w:ascii="Calibri" w:hAnsi="Calibri" w:eastAsia="微软雅黑" w:cs="Calibri"/>
-          <w:b w:val="0"/>
-          <w:sz w:val="21"/>
-        </w:rPr>
-        <w:t>经营概览：SUM(gmv) 得营业额，COUNT(*) 得订单数，两者相除得客单价；SUM(refund) / SUM(gmv) 得退货率；分母用 NULLIF，避免营业额为 0 时除零。</w:t>
-      </w:r>
-    </w:p>
-    <w:p>
-      <w:pPr>
-        <w:pStyle w:val="ListBullet"/>
-        <w:spacing w:after="20" w:before="0" w:line="259" w:lineRule="auto"/>
-      </w:pPr>
-      <w:r>
-        <w:rPr>
-          <w:rFonts w:ascii="Calibri" w:hAnsi="Calibri" w:eastAsia="微软雅黑" w:cs="Calibri"/>
-          <w:b w:val="0"/>
-          <w:sz w:val="21"/>
-        </w:rPr>
-        <w:t>筛选：WHERE order_date BETWEEN 开始 AND 结束，再加上类目、渠道；选「全部」时不额外限制该字段。</w:t>
-      </w:r>
-    </w:p>
-    <w:p>
-      <w:pPr>
-        <w:pStyle w:val="ListBullet"/>
-        <w:spacing w:after="20" w:before="0" w:line="259" w:lineRule="auto"/>
-      </w:pPr>
-      <w:r>
-        <w:rPr>
-          <w:rFonts w:ascii="Calibri" w:hAnsi="Calibri" w:eastAsia="微软雅黑" w:cs="Calibri"/>
-          <w:b w:val="0"/>
-          <w:sz w:val="21"/>
-        </w:rPr>
-        <w:t>类目对比：GROUP BY category，按营业额降序，同一查询里带上该类目退货率。</w:t>
-      </w:r>
-    </w:p>
-    <w:p>
-      <w:pPr>
-        <w:pStyle w:val="ListBullet"/>
-        <w:spacing w:after="20" w:before="0" w:line="259" w:lineRule="auto"/>
-      </w:pPr>
-      <w:r>
-        <w:rPr>
-          <w:rFonts w:ascii="Calibri" w:hAnsi="Calibri" w:eastAsia="微软雅黑" w:cs="Calibri"/>
-          <w:b w:val="0"/>
-          <w:sz w:val="21"/>
-        </w:rPr>
-        <w:t>漏斗：对流量表分别 SUM(views)、SUM(carts)、SUM(orders)、SUM(pays)，再算浏览→加购、加购→下单、下单→支付三个比率。</w:t>
-      </w:r>
-    </w:p>
-    <w:p>
-      <w:pPr>
-        <w:pStyle w:val="ListBullet"/>
-        <w:spacing w:after="20" w:before="0" w:line="259" w:lineRule="auto"/>
-      </w:pPr>
-      <w:r>
-        <w:rPr>
-          <w:rFonts w:ascii="Calibri" w:hAnsi="Calibri" w:eastAsia="微软雅黑" w:cs="Calibri"/>
-          <w:b w:val="0"/>
-          <w:sz w:val="21"/>
-        </w:rPr>
-        <w:t>客户结构：按是否新客汇总营业额，看新客、老客各占多少。</w:t>
-      </w:r>
-    </w:p>
-    <w:p>
-      <w:pPr>
-        <w:spacing w:after="60" w:before="160" w:line="259" w:lineRule="auto"/>
-        <w:pBdr>
-          <w:bottom w:val="single" w:sz="8" w:space="1" w:color="1F6F6A"/>
-        </w:pBdr>
-      </w:pPr>
-      <w:r>
-        <w:rPr>
-          <w:rFonts w:ascii="Calibri" w:hAnsi="Calibri" w:eastAsia="微软雅黑" w:cs="Calibri"/>
-          <w:b/>
-          <w:color w:val="1F6F6A"/>
-          <w:sz w:val="24"/>
+          <w:sz w:val="26"/>
+          <w:rFonts w:ascii="Calibri" w:hAnsi="Calibri" w:eastAsia="微软雅黑"/>
         </w:rPr>
         <w:t>项目经历</w:t>
       </w:r>
@@ -461,261 +318,68 @@
       </w:pPr>
       <w:r>
         <w:rPr>
-          <w:rFonts w:ascii="Calibri" w:hAnsi="Calibri" w:eastAsia="微软雅黑" w:cs="Calibri"/>
           <w:b/>
-          <w:sz w:val="21"/>
+          <w:sz w:val="22"/>
+          <w:rFonts w:ascii="Calibri" w:hAnsi="Calibri" w:eastAsia="微软雅黑"/>
         </w:rPr>
         <w:t>营析 · 网店经营分析台</w:t>
       </w:r>
     </w:p>
     <w:p>
       <w:pPr>
-        <w:spacing w:after="40" w:before="0" w:line="259" w:lineRule="auto"/>
+        <w:spacing w:after="60" w:before="0" w:line="259" w:lineRule="auto"/>
       </w:pPr>
       <w:r>
         <w:rPr>
-          <w:rFonts w:ascii="Calibri" w:hAnsi="Calibri" w:eastAsia="微软雅黑" w:cs="Calibri"/>
           <w:b w:val="0"/>
-          <w:sz w:val="21"/>
+          <w:sz w:val="22"/>
+          <w:rFonts w:ascii="Calibri" w:hAnsi="Calibri" w:eastAsia="微软雅黑"/>
         </w:rPr>
-        <w:t>独立完成的经营分析网站，已经部署，手机和电脑都能打开。要回答的问题是：这段时间卖了多少、哪一类货在退、客人在哪一步离开、钱主要来自新客还是老客。</w:t>
+        <w:t>独立完成并已上线的经营分析网站，手机和电脑都能打开。它不是一份只交上去的报告：同一套筛选下，营业额、退货、转化漏斗、新老客结构和三条经营建议会一起变，而且每条建议都能指回具体数字。</w:t>
       </w:r>
     </w:p>
     <w:p>
       <w:pPr>
-        <w:spacing w:after="40" w:before="0" w:line="259" w:lineRule="auto"/>
+        <w:spacing w:after="60" w:before="0" w:line="259" w:lineRule="auto"/>
       </w:pPr>
       <w:r>
         <w:rPr>
-          <w:rFonts w:ascii="Calibri" w:hAnsi="Calibri" w:eastAsia="微软雅黑" w:cs="Calibri"/>
           <w:b w:val="0"/>
-          <w:sz w:val="21"/>
+          <w:sz w:val="22"/>
+          <w:rFonts w:ascii="Calibri" w:hAnsi="Calibri" w:eastAsia="微软雅黑"/>
         </w:rPr>
-        <w:t>数据是按固定规则生成的 90 天练习订单，数字可以重复算出来，不是某家公司的真实后台。生成规则里故意做了差异：家居收纳退货更高，数码配件加购后下单更低，信息流广告转化低于老客回访。这样结论来自数据，而不是先写一句空话。</w:t>
+        <w:t>练习数据覆盖 90 天订单，按固定规则生成，不是某家公司的真实后台。规则里事先拉开了差异，例如家居收纳退货更高、数码配件加购后更难下单、信息流广告转化低于老客回访，用来练习先看数，再决定把预算放在哪。</w:t>
       </w:r>
     </w:p>
     <w:p>
       <w:pPr>
-        <w:spacing w:after="40" w:before="60" w:line="259" w:lineRule="auto"/>
+        <w:spacing w:after="60" w:before="0" w:line="259" w:lineRule="auto"/>
       </w:pPr>
       <w:r>
         <w:rPr>
-          <w:rFonts w:ascii="Calibri" w:hAnsi="Calibri" w:eastAsia="微软雅黑" w:cs="Calibri"/>
-          <w:b/>
-          <w:sz w:val="21"/>
+          <w:b w:val="0"/>
+          <w:sz w:val="22"/>
+          <w:rFonts w:ascii="Calibri" w:hAnsi="Calibri" w:eastAsia="微软雅黑"/>
         </w:rPr>
-        <w:t>表里有什么</w:t>
+        <w:t>近 90 天全部类目的结果：营业额 ¥525,328，订单 6,401，客单价 ¥82，退货率 8.2%。家居收纳退货率 18.8%，明显高于个护清洁的 4.3%。加购之后只有约 35% 会下单。老客贡献约 57% 的营业额，老客回访的付款比例高于信息流广告。据此建议先处理家居退货，并把一部分拉新预算改到已验证的渠道和复购。</w:t>
       </w:r>
     </w:p>
     <w:p>
       <w:pPr>
-        <w:pStyle w:val="ListBullet"/>
-        <w:spacing w:after="20" w:before="0" w:line="259" w:lineRule="auto"/>
+        <w:spacing w:after="60" w:before="0" w:line="259" w:lineRule="auto"/>
       </w:pPr>
       <w:r>
         <w:rPr>
-          <w:rFonts w:ascii="Calibri" w:hAnsi="Calibri" w:eastAsia="微软雅黑" w:cs="Calibri"/>
           <w:b w:val="0"/>
-          <w:sz w:val="21"/>
-        </w:rPr>
-        <w:t>订单：日期、类目（数码配件、家居收纳、个护清洁、食品饮料、运动户外）、渠道（自然搜索、信息流广告、直播、老客复访）、商品、金额、退货金额、是否新客。</w:t>
-      </w:r>
-    </w:p>
-    <w:p>
-      <w:pPr>
-        <w:pStyle w:val="ListBullet"/>
-        <w:spacing w:after="20" w:before="0" w:line="259" w:lineRule="auto"/>
-      </w:pPr>
-      <w:r>
-        <w:rPr>
-          <w:rFonts w:ascii="Calibri" w:hAnsi="Calibri" w:eastAsia="微软雅黑" w:cs="Calibri"/>
-          <w:b w:val="0"/>
-          <w:sz w:val="21"/>
-        </w:rPr>
-        <w:t>流量：同一天、同一类目、同一渠道下的浏览、加购、下单、支付人次。</w:t>
-      </w:r>
-    </w:p>
-    <w:p>
-      <w:pPr>
-        <w:spacing w:after="40" w:before="60" w:line="259" w:lineRule="auto"/>
-      </w:pPr>
-      <w:r>
-        <w:rPr>
-          <w:rFonts w:ascii="Calibri" w:hAnsi="Calibri" w:eastAsia="微软雅黑" w:cs="Calibri"/>
-          <w:b/>
-          <w:sz w:val="21"/>
-        </w:rPr>
-        <w:t>网站上有什么</w:t>
-      </w:r>
-    </w:p>
-    <w:p>
-      <w:pPr>
-        <w:pStyle w:val="ListBullet"/>
-        <w:spacing w:after="20" w:before="0" w:line="259" w:lineRule="auto"/>
-      </w:pPr>
-      <w:r>
-        <w:rPr>
-          <w:rFonts w:ascii="Calibri" w:hAnsi="Calibri" w:eastAsia="微软雅黑" w:cs="Calibri"/>
-          <w:b w:val="0"/>
-          <w:sz w:val="21"/>
-        </w:rPr>
-        <w:t>经营概览：营业额、订单、客单价、退货率，以及和上一等长时间的环比；营业额折线；类目条形图和明细表。</w:t>
-      </w:r>
-    </w:p>
-    <w:p>
-      <w:pPr>
-        <w:pStyle w:val="ListBullet"/>
-        <w:spacing w:after="20" w:before="0" w:line="259" w:lineRule="auto"/>
-      </w:pPr>
-      <w:r>
-        <w:rPr>
-          <w:rFonts w:ascii="Calibri" w:hAnsi="Calibri" w:eastAsia="微软雅黑" w:cs="Calibri"/>
-          <w:b w:val="0"/>
-          <w:sz w:val="21"/>
-        </w:rPr>
-        <w:t>转化漏斗：四步人数和三步转化率，下面按渠道拆。</w:t>
-      </w:r>
-    </w:p>
-    <w:p>
-      <w:pPr>
-        <w:pStyle w:val="ListBullet"/>
-        <w:spacing w:after="20" w:before="0" w:line="259" w:lineRule="auto"/>
-      </w:pPr>
-      <w:r>
-        <w:rPr>
-          <w:rFonts w:ascii="Calibri" w:hAnsi="Calibri" w:eastAsia="微软雅黑" w:cs="Calibri"/>
-          <w:b w:val="0"/>
-          <w:sz w:val="21"/>
-        </w:rPr>
-        <w:t>客户结构：新客 / 老客营业额占比，以及筛选期内下过至少两单的用户占比。</w:t>
-      </w:r>
-    </w:p>
-    <w:p>
-      <w:pPr>
-        <w:pStyle w:val="ListBullet"/>
-        <w:spacing w:after="20" w:before="0" w:line="259" w:lineRule="auto"/>
-      </w:pPr>
-      <w:r>
-        <w:rPr>
-          <w:rFonts w:ascii="Calibri" w:hAnsi="Calibri" w:eastAsia="微软雅黑" w:cs="Calibri"/>
-          <w:b w:val="0"/>
-          <w:sz w:val="21"/>
-        </w:rPr>
-        <w:t>结论：三条建议会随上面的筛选重算。默认先看近 30 天、全部类目。</w:t>
-      </w:r>
-    </w:p>
-    <w:p>
-      <w:pPr>
-        <w:pStyle w:val="ListBullet"/>
-        <w:spacing w:after="20" w:before="0" w:line="259" w:lineRule="auto"/>
-      </w:pPr>
-      <w:r>
-        <w:rPr>
-          <w:rFonts w:ascii="Calibri" w:hAnsi="Calibri" w:eastAsia="微软雅黑" w:cs="Calibri"/>
-          <w:b w:val="0"/>
-          <w:sz w:val="21"/>
-        </w:rPr>
-        <w:t>方法：每一项指标的定义，以及和页面对得上的 SQL。</w:t>
-      </w:r>
-    </w:p>
-    <w:p>
-      <w:pPr>
-        <w:spacing w:after="40" w:before="60" w:line="259" w:lineRule="auto"/>
-      </w:pPr>
-      <w:r>
-        <w:rPr>
-          <w:rFonts w:ascii="Calibri" w:hAnsi="Calibri" w:eastAsia="微软雅黑" w:cs="Calibri"/>
-          <w:b/>
-          <w:sz w:val="21"/>
-        </w:rPr>
-        <w:t>近 90 天、全部类目和渠道的结果</w:t>
-      </w:r>
-    </w:p>
-    <w:p>
-      <w:pPr>
-        <w:pStyle w:val="ListBullet"/>
-        <w:spacing w:after="20" w:before="0" w:line="259" w:lineRule="auto"/>
-      </w:pPr>
-      <w:r>
-        <w:rPr>
-          <w:rFonts w:ascii="Calibri" w:hAnsi="Calibri" w:eastAsia="微软雅黑" w:cs="Calibri"/>
-          <w:b w:val="0"/>
-          <w:sz w:val="21"/>
-        </w:rPr>
-        <w:t>营业额 ¥525,328，订单 6,401，客单价 ¥82，退货率 8.2%，浏览→支付 14.4%。</w:t>
-      </w:r>
-    </w:p>
-    <w:p>
-      <w:pPr>
-        <w:pStyle w:val="ListBullet"/>
-        <w:spacing w:after="20" w:before="0" w:line="259" w:lineRule="auto"/>
-      </w:pPr>
-      <w:r>
-        <w:rPr>
-          <w:rFonts w:ascii="Calibri" w:hAnsi="Calibri" w:eastAsia="微软雅黑" w:cs="Calibri"/>
-          <w:b w:val="0"/>
-          <w:sz w:val="21"/>
-        </w:rPr>
-        <w:t>家居收纳退货率 18.8%，个护清洁 4.3%。建议先改家居详情页的尺寸说明和质检，而不是给这个类目继续加预算。</w:t>
-      </w:r>
-    </w:p>
-    <w:p>
-      <w:pPr>
-        <w:pStyle w:val="ListBullet"/>
-        <w:spacing w:after="20" w:before="0" w:line="259" w:lineRule="auto"/>
-      </w:pPr>
-      <w:r>
-        <w:rPr>
-          <w:rFonts w:ascii="Calibri" w:hAnsi="Calibri" w:eastAsia="微软雅黑" w:cs="Calibri"/>
-          <w:b w:val="0"/>
-          <w:sz w:val="21"/>
-        </w:rPr>
-        <w:t>加购→下单 35.1%，是四步里掉得最多的一步。信息流广告浏览→支付 8.5%，老客复访 30.5%。建议把预算放到已经验证过的渠道。</w:t>
-      </w:r>
-    </w:p>
-    <w:p>
-      <w:pPr>
-        <w:pStyle w:val="ListBullet"/>
-        <w:spacing w:after="20" w:before="0" w:line="259" w:lineRule="auto"/>
-      </w:pPr>
-      <w:r>
-        <w:rPr>
-          <w:rFonts w:ascii="Calibri" w:hAnsi="Calibri" w:eastAsia="微软雅黑" w:cs="Calibri"/>
-          <w:b w:val="0"/>
-          <w:sz w:val="21"/>
-        </w:rPr>
-        <w:t>老客贡献 57.2% 营业额，复购用户占付款用户 59.2%。建议把一部分拉新券改成复购券和补货提醒。</w:t>
-      </w:r>
-    </w:p>
-    <w:p>
-      <w:pPr>
-        <w:spacing w:after="40" w:before="0" w:line="259" w:lineRule="auto"/>
-      </w:pPr>
-      <w:r>
-        <w:rPr>
-          <w:rFonts w:ascii="Calibri" w:hAnsi="Calibri" w:eastAsia="微软雅黑" w:cs="Calibri"/>
-          <w:b w:val="0"/>
-          <w:sz w:val="21"/>
-        </w:rPr>
-        <w:t>页面技术：Next.js、TypeScript、Recharts。筛选和汇总在应用里完成，方法页给出同等口径的 SQL。</w:t>
-      </w:r>
-    </w:p>
-    <w:p>
-      <w:pPr>
-        <w:spacing w:after="40" w:before="0" w:line="259" w:lineRule="auto"/>
-      </w:pPr>
-      <w:r>
-        <w:rPr>
-          <w:rFonts w:ascii="Calibri" w:hAnsi="Calibri" w:eastAsia="微软雅黑" w:cs="Calibri"/>
-          <w:b w:val="0"/>
-          <w:sz w:val="21"/>
+          <w:sz w:val="22"/>
+          <w:rFonts w:ascii="Calibri" w:hAnsi="Calibri" w:eastAsia="微软雅黑"/>
         </w:rPr>
         <w:t>在线演示：https://yingxi-analytics.vercel.app</w:t>
       </w:r>
     </w:p>
     <w:sectPr>
-      <w:pgSz w:w="11906" w:h="16838"/>
-      <w:pgMar w:top="794" w:right="907" w:bottom="794" w:left="907" w:header="720" w:footer="720" w:gutter="0"/>
+      <w:pgSz w:w="12240" w:h="15840"/>
+      <w:pgMar w:top="850" w:right="964" w:bottom="850" w:left="964" w:header="720" w:footer="720" w:gutter="0"/>
       <w:cols w:space="720"/>
       <w:docGrid w:linePitch="360"/>
     </w:sectPr>

</xml_diff>

<commit_message>
Rewrite the Yingxi resume blurb and move page detail to the README.
State the live funnel and the 90-day findings on the resume, and put the field list plus how the numbers are computed in the GitHub readme.

Co-authored-by: entice0328 <entice0328@gmail.com>
</commit_message>
<xml_diff>
--- a/Zhang_Liyuan_Data_Analyst_Resume.docx
+++ b/Zhang_Liyuan_Data_Analyst_Resume.docx
@@ -335,7 +335,7 @@
           <w:sz w:val="22"/>
           <w:rFonts w:ascii="Calibri" w:hAnsi="Calibri" w:eastAsia="微软雅黑"/>
         </w:rPr>
-        <w:t>独立完成并已上线的经营分析网站，手机和电脑都能打开。它不是一份只交上去的报告：同一套筛选下，营业额、退货、转化漏斗、新老客结构和三条经营建议会一起变，而且每条建议都能指回具体数字。</w:t>
+        <w:t>独立开发的经营分析网站，已上传至 GitHub，手机和电脑都能打开。页面带可筛选的数据分析漏斗，用来看这段时间卖了多少、哪一类货在退、客人在哪一步离开、钱主要来自新客还是老客。</w:t>
       </w:r>
     </w:p>
     <w:p>
@@ -348,7 +348,7 @@
           <w:sz w:val="22"/>
           <w:rFonts w:ascii="Calibri" w:hAnsi="Calibri" w:eastAsia="微软雅黑"/>
         </w:rPr>
-        <w:t>练习数据覆盖 90 天订单，按固定规则生成，不是某家公司的真实后台。规则里事先拉开了差异，例如家居收纳退货更高、数码配件加购后更难下单、信息流广告转化低于老客回访，用来练习先看数，再决定把预算放在哪。</w:t>
+        <w:t>数据按固定规则生成，时段为 90 天，不是真实公司的后台。生成规则考虑到了差异，例如家居收纳退货更高，数码配件加购后下单更低，信息流广告转化低于老客回访。</w:t>
       </w:r>
     </w:p>
     <w:p>
@@ -361,7 +361,20 @@
           <w:sz w:val="22"/>
           <w:rFonts w:ascii="Calibri" w:hAnsi="Calibri" w:eastAsia="微软雅黑"/>
         </w:rPr>
-        <w:t>近 90 天全部类目的结果：营业额 ¥525,328，订单 6,401，客单价 ¥82，退货率 8.2%。家居收纳退货率 18.8%，明显高于个护清洁的 4.3%。加购之后只有约 35% 会下单。老客贡献约 57% 的营业额，老客回访的付款比例高于信息流广告。据此建议先处理家居退货，并把一部分拉新预算改到已验证的渠道和复购。</w:t>
+        <w:t>近 90 天、全部类目和渠道：营业额 ¥525,328，订单 6,401，客单价 ¥82，退货率 8.2%，浏览→支付 14.4%。家居收纳退货率 18.8%，个护清洁 4.3%，建议先改家居详情页的尺寸说明和质检，而不是给这个类目继续加预算。加购→下单 35.1%，是四步里掉得最多的一步。信息流广告浏览→支付 8.5%，老客复访 30.5%，建议把预算放到已经验证过的渠道。老客贡献 57.2% 营业额，复购用户占付款用户 59.2%，建议把一部分拉新券改成复购券和补货提醒。</w:t>
+      </w:r>
+    </w:p>
+    <w:p>
+      <w:pPr>
+        <w:spacing w:after="60" w:before="0" w:line="259" w:lineRule="auto"/>
+      </w:pPr>
+      <w:r>
+        <w:rPr>
+          <w:b w:val="0"/>
+          <w:sz w:val="22"/>
+          <w:rFonts w:ascii="Calibri" w:hAnsi="Calibri" w:eastAsia="微软雅黑"/>
+        </w:rPr>
+        <w:t>页面技术：Next.js、TypeScript、Recharts。筛选和汇总在应用里完成，方法页给出同等口径的 SQL。</w:t>
       </w:r>
     </w:p>
     <w:p>

</xml_diff>

<commit_message>
Keep the Yingxi resume entry to the two paragraphs requested.
Move the site inventory, results, and stack into GitHub sections titled website content and backend content.

Co-authored-by: entice0328 <entice0328@gmail.com>
</commit_message>
<xml_diff>
--- a/Zhang_Liyuan_Data_Analyst_Resume.docx
+++ b/Zhang_Liyuan_Data_Analyst_Resume.docx
@@ -335,7 +335,7 @@
           <w:sz w:val="22"/>
           <w:rFonts w:ascii="Calibri" w:hAnsi="Calibri" w:eastAsia="微软雅黑"/>
         </w:rPr>
-        <w:t>独立开发的经营分析网站，已上传至 GitHub，手机和电脑都能打开。页面带可筛选的数据分析漏斗，用来看这段时间卖了多少、哪一类货在退、客人在哪一步离开、钱主要来自新客还是老客。</w:t>
+        <w:t>独立开发的经营分析网站，已上传至 GitHub，兼容不同设备 UI，具备自动化的数据分析漏斗，包括：这段时间卖了多少、哪一类货在退、客人在哪一步离开、钱主要来自新客还是老客。</w:t>
       </w:r>
     </w:p>
     <w:p>
@@ -348,33 +348,7 @@
           <w:sz w:val="22"/>
           <w:rFonts w:ascii="Calibri" w:hAnsi="Calibri" w:eastAsia="微软雅黑"/>
         </w:rPr>
-        <w:t>数据按固定规则生成，时段为 90 天，不是真实公司的后台。生成规则考虑到了差异，例如家居收纳退货更高，数码配件加购后下单更低，信息流广告转化低于老客回访。</w:t>
-      </w:r>
-    </w:p>
-    <w:p>
-      <w:pPr>
-        <w:spacing w:after="60" w:before="0" w:line="259" w:lineRule="auto"/>
-      </w:pPr>
-      <w:r>
-        <w:rPr>
-          <w:b w:val="0"/>
-          <w:sz w:val="22"/>
-          <w:rFonts w:ascii="Calibri" w:hAnsi="Calibri" w:eastAsia="微软雅黑"/>
-        </w:rPr>
-        <w:t>近 90 天、全部类目和渠道：营业额 ¥525,328，订单 6,401，客单价 ¥82，退货率 8.2%，浏览→支付 14.4%。家居收纳退货率 18.8%，个护清洁 4.3%，建议先改家居详情页的尺寸说明和质检，而不是给这个类目继续加预算。加购→下单 35.1%，是四步里掉得最多的一步。信息流广告浏览→支付 8.5%，老客复访 30.5%，建议把预算放到已经验证过的渠道。老客贡献 57.2% 营业额，复购用户占付款用户 59.2%，建议把一部分拉新券改成复购券和补货提醒。</w:t>
-      </w:r>
-    </w:p>
-    <w:p>
-      <w:pPr>
-        <w:spacing w:after="60" w:before="0" w:line="259" w:lineRule="auto"/>
-      </w:pPr>
-      <w:r>
-        <w:rPr>
-          <w:b w:val="0"/>
-          <w:sz w:val="22"/>
-          <w:rFonts w:ascii="Calibri" w:hAnsi="Calibri" w:eastAsia="微软雅黑"/>
-        </w:rPr>
-        <w:t>页面技术：Next.js、TypeScript、Recharts。筛选和汇总在应用里完成，方法页给出同等口径的 SQL。</w:t>
+        <w:t>数据按照固定规则生成，时段为 90 天，并不是真实公司的后台。生成规则考虑到了差异化，例如：家居收纳退货更高，数码配件加购后下单更低，信息流广告转化低于老客回访。</w:t>
       </w:r>
     </w:p>
     <w:p>

</xml_diff>

<commit_message>
Polish the resume link, course list, and knowledge-area line breaks.
Keep the current structure and only fix the truncated GitHub URL, the stray comma, and the run-together expertise paragraph.

Co-authored-by: entice0328 <entice0328@gmail.com>
</commit_message>
<xml_diff>
--- a/Zhang_Liyuan_Data_Analyst_Resume.docx
+++ b/Zhang_Liyuan_Data_Analyst_Resume.docx
@@ -43,37 +43,7 @@
     </w:p>
     <w:p>
       <w:pPr>
-        <w:spacing w:after="80" w:before="200" w:line="259" w:lineRule="auto"/>
-        <w:pBdr>
-          <w:bottom w:val="single" w:sz="8" w:space="1" w:color="1F6F6A"/>
-        </w:pBdr>
-      </w:pPr>
-      <w:r>
-        <w:rPr>
-          <w:b/>
-          <w:color w:val="1F6F6A"/>
-          <w:sz w:val="26"/>
-          <w:rFonts w:ascii="Calibri" w:hAnsi="Calibri" w:eastAsia="微软雅黑"/>
-        </w:rPr>
-        <w:t>求职意向</w:t>
-      </w:r>
-    </w:p>
-    <w:p>
-      <w:pPr>
-        <w:spacing w:after="60" w:before="0" w:line="259" w:lineRule="auto"/>
-      </w:pPr>
-      <w:r>
-        <w:rPr>
-          <w:b w:val="0"/>
-          <w:sz w:val="22"/>
-          <w:rFonts w:ascii="Calibri" w:hAnsi="Calibri" w:eastAsia="微软雅黑"/>
-        </w:rPr>
-        <w:t>武汉 · 数据分析 / 数据运营 / 商业分析 / BI 实习。计划 2026 年 1 月到岗，10 月起可沟通，12 月可面试。</w:t>
-      </w:r>
-    </w:p>
-    <w:p>
-      <w:pPr>
-        <w:spacing w:after="80" w:before="200" w:line="259" w:lineRule="auto"/>
+        <w:spacing w:after="60" w:before="200" w:line="259" w:lineRule="auto"/>
         <w:pBdr>
           <w:bottom w:val="single" w:sz="8" w:space="1" w:color="1F6F6A"/>
         </w:pBdr>
@@ -103,7 +73,7 @@
     </w:p>
     <w:p>
       <w:pPr>
-        <w:spacing w:after="20" w:before="0" w:line="259" w:lineRule="auto"/>
+        <w:spacing w:after="40" w:before="0" w:line="259" w:lineRule="auto"/>
       </w:pPr>
       <w:r>
         <w:rPr>
@@ -111,30 +81,21 @@
           <w:sz w:val="22"/>
           <w:rFonts w:ascii="Calibri" w:hAnsi="Calibri" w:eastAsia="微软雅黑"/>
         </w:rPr>
-        <w:t>Bachelor of Science (Honours) in Computer Science with a specialism in Data Analytics</w:t>
+        <w:t>Bachelor of Science (Honours) in Computer Science with a specialism in Data Analytics    2025 – 至今    本科二年级</w:t>
       </w:r>
     </w:p>
     <w:p>
       <w:pPr>
-        <w:spacing w:after="60" w:before="0" w:line="259" w:lineRule="auto"/>
-      </w:pPr>
-      <w:r>
-        <w:rPr>
-          <w:b w:val="0"/>
-          <w:sz w:val="22"/>
-          <w:rFonts w:ascii="Calibri" w:hAnsi="Calibri" w:eastAsia="微软雅黑"/>
-        </w:rPr>
-        <w:t>2025 – 至今    本科二年级</w:t>
-      </w:r>
-    </w:p>
-    <w:p>
-      <w:pPr>
-        <w:spacing w:after="40" w:before="120" w:line="259" w:lineRule="auto"/>
+        <w:spacing w:after="60" w:before="200" w:line="259" w:lineRule="auto"/>
+        <w:pBdr>
+          <w:bottom w:val="single" w:sz="8" w:space="1" w:color="1F6F6A"/>
+        </w:pBdr>
       </w:pPr>
       <w:r>
         <w:rPr>
           <w:b/>
-          <w:sz w:val="22"/>
+          <w:color w:val="1F6F6A"/>
+          <w:sz w:val="26"/>
           <w:rFonts w:ascii="Calibri" w:hAnsi="Calibri" w:eastAsia="微软雅黑"/>
         </w:rPr>
         <w:t>课程</w:t>
@@ -143,7 +104,7 @@
     <w:p>
       <w:pPr>
         <w:pStyle w:val="ListBullet"/>
-        <w:spacing w:after="40" w:line="259" w:lineRule="auto"/>
+        <w:spacing w:after="20" w:line="259" w:lineRule="auto"/>
       </w:pPr>
       <w:r>
         <w:rPr>
@@ -151,13 +112,13 @@
           <w:sz w:val="22"/>
           <w:rFonts w:ascii="Calibri" w:hAnsi="Calibri" w:eastAsia="微软雅黑"/>
         </w:rPr>
-        <w:t>大一：Python Programming，Introduction to C Programming，Introduction to Databases，Systems Analysis and Design，Introduction to Networking，Systems Software and Computing Concepts，Integrated Computer Systems，Mathematical Concepts for Computing，Introduction to Artificial Intelligence</w:t>
+        <w:t>Python Programming</w:t>
       </w:r>
     </w:p>
     <w:p>
       <w:pPr>
         <w:pStyle w:val="ListBullet"/>
-        <w:spacing w:after="40" w:line="259" w:lineRule="auto"/>
+        <w:spacing w:after="20" w:line="259" w:lineRule="auto"/>
       </w:pPr>
       <w:r>
         <w:rPr>
@@ -165,17 +126,189 @@
           <w:sz w:val="22"/>
           <w:rFonts w:ascii="Calibri" w:hAnsi="Calibri" w:eastAsia="微软雅黑"/>
         </w:rPr>
-        <w:t>大二在修（没上过的删掉）：Object Oriented Development with Java，Probability and Statistical Modelling，Data Structures，Data Management，Data Mining and Predictive Modelling</w:t>
+        <w:t>Introduction to C Programming</w:t>
       </w:r>
     </w:p>
     <w:p>
       <w:pPr>
-        <w:spacing w:after="40" w:before="120" w:line="259" w:lineRule="auto"/>
+        <w:pStyle w:val="ListBullet"/>
+        <w:spacing w:after="20" w:line="259" w:lineRule="auto"/>
+      </w:pPr>
+      <w:r>
+        <w:rPr>
+          <w:b w:val="0"/>
+          <w:sz w:val="22"/>
+          <w:rFonts w:ascii="Calibri" w:hAnsi="Calibri" w:eastAsia="微软雅黑"/>
+        </w:rPr>
+        <w:t>Introduction to Databases</w:t>
+      </w:r>
+    </w:p>
+    <w:p>
+      <w:pPr>
+        <w:pStyle w:val="ListBullet"/>
+        <w:spacing w:after="20" w:line="259" w:lineRule="auto"/>
+      </w:pPr>
+      <w:r>
+        <w:rPr>
+          <w:b w:val="0"/>
+          <w:sz w:val="22"/>
+          <w:rFonts w:ascii="Calibri" w:hAnsi="Calibri" w:eastAsia="微软雅黑"/>
+        </w:rPr>
+        <w:t>Systems Analysis and Design</w:t>
+      </w:r>
+    </w:p>
+    <w:p>
+      <w:pPr>
+        <w:pStyle w:val="ListBullet"/>
+        <w:spacing w:after="20" w:line="259" w:lineRule="auto"/>
+      </w:pPr>
+      <w:r>
+        <w:rPr>
+          <w:b w:val="0"/>
+          <w:sz w:val="22"/>
+          <w:rFonts w:ascii="Calibri" w:hAnsi="Calibri" w:eastAsia="微软雅黑"/>
+        </w:rPr>
+        <w:t>Introduction to Networking</w:t>
+      </w:r>
+    </w:p>
+    <w:p>
+      <w:pPr>
+        <w:pStyle w:val="ListBullet"/>
+        <w:spacing w:after="20" w:line="259" w:lineRule="auto"/>
+      </w:pPr>
+      <w:r>
+        <w:rPr>
+          <w:b w:val="0"/>
+          <w:sz w:val="22"/>
+          <w:rFonts w:ascii="Calibri" w:hAnsi="Calibri" w:eastAsia="微软雅黑"/>
+        </w:rPr>
+        <w:t>Systems Software and Computing Concepts</w:t>
+      </w:r>
+    </w:p>
+    <w:p>
+      <w:pPr>
+        <w:pStyle w:val="ListBullet"/>
+        <w:spacing w:after="20" w:line="259" w:lineRule="auto"/>
+      </w:pPr>
+      <w:r>
+        <w:rPr>
+          <w:b w:val="0"/>
+          <w:sz w:val="22"/>
+          <w:rFonts w:ascii="Calibri" w:hAnsi="Calibri" w:eastAsia="微软雅黑"/>
+        </w:rPr>
+        <w:t>Integrated Computer Systems</w:t>
+      </w:r>
+    </w:p>
+    <w:p>
+      <w:pPr>
+        <w:pStyle w:val="ListBullet"/>
+        <w:spacing w:after="20" w:line="259" w:lineRule="auto"/>
+      </w:pPr>
+      <w:r>
+        <w:rPr>
+          <w:b w:val="0"/>
+          <w:sz w:val="22"/>
+          <w:rFonts w:ascii="Calibri" w:hAnsi="Calibri" w:eastAsia="微软雅黑"/>
+        </w:rPr>
+        <w:t>Mathematical Concepts for Computing</w:t>
+      </w:r>
+    </w:p>
+    <w:p>
+      <w:pPr>
+        <w:pStyle w:val="ListBullet"/>
+        <w:spacing w:after="20" w:line="259" w:lineRule="auto"/>
+      </w:pPr>
+      <w:r>
+        <w:rPr>
+          <w:b w:val="0"/>
+          <w:sz w:val="22"/>
+          <w:rFonts w:ascii="Calibri" w:hAnsi="Calibri" w:eastAsia="微软雅黑"/>
+        </w:rPr>
+        <w:t>Introduction to Artificial Intelligence</w:t>
+      </w:r>
+    </w:p>
+    <w:p>
+      <w:pPr>
+        <w:pStyle w:val="ListBullet"/>
+        <w:spacing w:after="20" w:line="259" w:lineRule="auto"/>
+      </w:pPr>
+      <w:r>
+        <w:rPr>
+          <w:b w:val="0"/>
+          <w:sz w:val="22"/>
+          <w:rFonts w:ascii="Calibri" w:hAnsi="Calibri" w:eastAsia="微软雅黑"/>
+        </w:rPr>
+        <w:t>Object Oriented Development with Java</w:t>
+      </w:r>
+    </w:p>
+    <w:p>
+      <w:pPr>
+        <w:pStyle w:val="ListBullet"/>
+        <w:spacing w:after="20" w:line="259" w:lineRule="auto"/>
+      </w:pPr>
+      <w:r>
+        <w:rPr>
+          <w:b w:val="0"/>
+          <w:sz w:val="22"/>
+          <w:rFonts w:ascii="Calibri" w:hAnsi="Calibri" w:eastAsia="微软雅黑"/>
+        </w:rPr>
+        <w:t>Probability and Statistical Modelling</w:t>
+      </w:r>
+    </w:p>
+    <w:p>
+      <w:pPr>
+        <w:pStyle w:val="ListBullet"/>
+        <w:spacing w:after="20" w:line="259" w:lineRule="auto"/>
+      </w:pPr>
+      <w:r>
+        <w:rPr>
+          <w:b w:val="0"/>
+          <w:sz w:val="22"/>
+          <w:rFonts w:ascii="Calibri" w:hAnsi="Calibri" w:eastAsia="微软雅黑"/>
+        </w:rPr>
+        <w:t>Data Structures</w:t>
+      </w:r>
+    </w:p>
+    <w:p>
+      <w:pPr>
+        <w:pStyle w:val="ListBullet"/>
+        <w:spacing w:after="20" w:line="259" w:lineRule="auto"/>
+      </w:pPr>
+      <w:r>
+        <w:rPr>
+          <w:b w:val="0"/>
+          <w:sz w:val="22"/>
+          <w:rFonts w:ascii="Calibri" w:hAnsi="Calibri" w:eastAsia="微软雅黑"/>
+        </w:rPr>
+        <w:t>Data Management</w:t>
+      </w:r>
+    </w:p>
+    <w:p>
+      <w:pPr>
+        <w:pStyle w:val="ListBullet"/>
+        <w:spacing w:after="20" w:line="259" w:lineRule="auto"/>
+      </w:pPr>
+      <w:r>
+        <w:rPr>
+          <w:b w:val="0"/>
+          <w:sz w:val="22"/>
+          <w:rFonts w:ascii="Calibri" w:hAnsi="Calibri" w:eastAsia="微软雅黑"/>
+        </w:rPr>
+        <w:t>Data Mining and Predictive Modelling</w:t>
+      </w:r>
+    </w:p>
+    <w:p>
+      <w:pPr>
+        <w:spacing w:after="60" w:before="200" w:line="259" w:lineRule="auto"/>
+        <w:pBdr>
+          <w:bottom w:val="single" w:sz="8" w:space="1" w:color="1F6F6A"/>
+        </w:pBdr>
       </w:pPr>
       <w:r>
         <w:rPr>
           <w:b/>
-          <w:sz w:val="22"/>
+          <w:color w:val="1F6F6A"/>
+          <w:sz w:val="26"/>
           <w:rFonts w:ascii="Calibri" w:hAnsi="Calibri" w:eastAsia="微软雅黑"/>
         </w:rPr>
         <w:t>专业知识</w:t>
@@ -184,7 +317,7 @@
     <w:p>
       <w:pPr>
         <w:pStyle w:val="ListBullet"/>
-        <w:spacing w:after="40" w:line="259" w:lineRule="auto"/>
+        <w:spacing w:after="20" w:line="259" w:lineRule="auto"/>
       </w:pPr>
       <w:r>
         <w:rPr>
@@ -192,13 +325,13 @@
           <w:sz w:val="22"/>
           <w:rFonts w:ascii="Calibri" w:hAnsi="Calibri" w:eastAsia="微软雅黑"/>
         </w:rPr>
-        <w:t>理论：计算相关数学，概率与统计，数据结构与算法基础</w:t>
+        <w:t>理论：Calculus，Linear Algebra，Discrete Mathematics，Mathematical Logic，Tree and Graph Theory，Probability and Statistics，Data Structure and Algorithms，Mathematical Modelling</w:t>
       </w:r>
     </w:p>
     <w:p>
       <w:pPr>
         <w:pStyle w:val="ListBullet"/>
-        <w:spacing w:after="40" w:line="259" w:lineRule="auto"/>
+        <w:spacing w:after="20" w:line="259" w:lineRule="auto"/>
       </w:pPr>
       <w:r>
         <w:rPr>
@@ -206,13 +339,13 @@
           <w:sz w:val="22"/>
           <w:rFonts w:ascii="Calibri" w:hAnsi="Calibri" w:eastAsia="微软雅黑"/>
         </w:rPr>
-        <w:t>系统：计算机组成与操作系统入门，计算机网络，集成计算机系统</w:t>
+        <w:t>系统：Computer Organization，Operating System，Digital Logic，Computer Networks，Concurrent Systems，Integrated Computer Systems，Unix-like Systems</w:t>
       </w:r>
     </w:p>
     <w:p>
       <w:pPr>
         <w:pStyle w:val="ListBullet"/>
-        <w:spacing w:after="40" w:line="259" w:lineRule="auto"/>
+        <w:spacing w:after="20" w:line="259" w:lineRule="auto"/>
       </w:pPr>
       <w:r>
         <w:rPr>
@@ -220,13 +353,13 @@
           <w:sz w:val="22"/>
           <w:rFonts w:ascii="Calibri" w:hAnsi="Calibri" w:eastAsia="微软雅黑"/>
         </w:rPr>
-        <w:t>软件工程：系统分析与设计，从业务需求拆到功能和数据，面向对象设计</w:t>
+        <w:t>软件工程：Systems Analysis and Design，System Development Life Cycle，Requirements Engineering，Software Project Management，Object-Oriented Design</w:t>
       </w:r>
     </w:p>
     <w:p>
       <w:pPr>
         <w:pStyle w:val="ListBullet"/>
-        <w:spacing w:after="40" w:line="259" w:lineRule="auto"/>
+        <w:spacing w:after="20" w:line="259" w:lineRule="auto"/>
       </w:pPr>
       <w:r>
         <w:rPr>
@@ -234,13 +367,13 @@
           <w:sz w:val="22"/>
           <w:rFonts w:ascii="Calibri" w:hAnsi="Calibri" w:eastAsia="微软雅黑"/>
         </w:rPr>
-        <w:t>数据科学：数据库设计与查询，数据管理，数据挖掘入门</w:t>
+        <w:t>数据科学：Database Systems Design and Application，Data Management Methods，Data Mining</w:t>
       </w:r>
     </w:p>
     <w:p>
       <w:pPr>
         <w:pStyle w:val="ListBullet"/>
-        <w:spacing w:after="40" w:line="259" w:lineRule="auto"/>
+        <w:spacing w:after="20" w:line="259" w:lineRule="auto"/>
       </w:pPr>
       <w:r>
         <w:rPr>
@@ -248,13 +381,13 @@
           <w:sz w:val="22"/>
           <w:rFonts w:ascii="Calibri" w:hAnsi="Calibri" w:eastAsia="微软雅黑"/>
         </w:rPr>
-        <w:t>人工智能：人工智能的基本概念和简单应用</w:t>
+        <w:t>人工智能：Applications of AI Agents，Machine Learning，Expert System，History of AI Development，Prompt Engineering</w:t>
       </w:r>
     </w:p>
     <w:p>
       <w:pPr>
         <w:pStyle w:val="ListBullet"/>
-        <w:spacing w:after="40" w:line="259" w:lineRule="auto"/>
+        <w:spacing w:after="20" w:line="259" w:lineRule="auto"/>
       </w:pPr>
       <w:r>
         <w:rPr>
@@ -262,12 +395,12 @@
           <w:sz w:val="22"/>
           <w:rFonts w:ascii="Calibri" w:hAnsi="Calibri" w:eastAsia="微软雅黑"/>
         </w:rPr>
-        <w:t>编程与工具：Python，C，Java，R，Power BI</w:t>
+        <w:t>编程与工具：Python，NumPy，Pandas，C，C++，Java，R，Power BI，HTML，x86_64 Assembly</w:t>
       </w:r>
     </w:p>
     <w:p>
       <w:pPr>
-        <w:spacing w:after="80" w:before="200" w:line="259" w:lineRule="auto"/>
+        <w:spacing w:after="60" w:before="200" w:line="259" w:lineRule="auto"/>
         <w:pBdr>
           <w:bottom w:val="single" w:sz="8" w:space="1" w:color="1F6F6A"/>
         </w:pBdr>
@@ -284,7 +417,7 @@
     </w:p>
     <w:p>
       <w:pPr>
-        <w:spacing w:after="60" w:before="0" w:line="259" w:lineRule="auto"/>
+        <w:spacing w:after="40" w:before="0" w:line="259" w:lineRule="auto"/>
       </w:pPr>
       <w:r>
         <w:rPr>
@@ -292,12 +425,12 @@
           <w:sz w:val="22"/>
           <w:rFonts w:ascii="Calibri" w:hAnsi="Calibri" w:eastAsia="微软雅黑"/>
         </w:rPr>
-        <w:t>2026 年 8 月 18 日参加 APAC 的 Introduction to Power BI Workshop，获参与证书。内容是把数据导入 Power BI 并做基础图表。</w:t>
+        <w:t>2026 年 8 月 18 日参加 APAC 的 Introduction to Power BI Workshop，拿到参与证书。</w:t>
       </w:r>
     </w:p>
     <w:p>
       <w:pPr>
-        <w:spacing w:after="80" w:before="200" w:line="259" w:lineRule="auto"/>
+        <w:spacing w:after="60" w:before="200" w:line="259" w:lineRule="auto"/>
         <w:pBdr>
           <w:bottom w:val="single" w:sz="8" w:space="1" w:color="1F6F6A"/>
         </w:pBdr>
@@ -327,7 +460,7 @@
     </w:p>
     <w:p>
       <w:pPr>
-        <w:spacing w:after="60" w:before="0" w:line="259" w:lineRule="auto"/>
+        <w:spacing w:after="40" w:before="0" w:line="259" w:lineRule="auto"/>
       </w:pPr>
       <w:r>
         <w:rPr>
@@ -340,7 +473,7 @@
     </w:p>
     <w:p>
       <w:pPr>
-        <w:spacing w:after="60" w:before="0" w:line="259" w:lineRule="auto"/>
+        <w:spacing w:after="40" w:before="0" w:line="259" w:lineRule="auto"/>
       </w:pPr>
       <w:r>
         <w:rPr>
@@ -353,7 +486,7 @@
     </w:p>
     <w:p>
       <w:pPr>
-        <w:spacing w:after="60" w:before="0" w:line="259" w:lineRule="auto"/>
+        <w:spacing w:after="40" w:before="0" w:line="259" w:lineRule="auto"/>
       </w:pPr>
       <w:r>
         <w:rPr>

</xml_diff>